<commit_message>
auto: Cowork/CLI 동기화 2026-06-29 00:35
</commit_message>
<xml_diff>
--- a/DEV_ITEM/호두AI_발명개념서_v0.1.docx
+++ b/DEV_ITEM/호두AI_발명개념서_v0.1.docx
@@ -396,6 +396,13 @@
     </w:tbl>
     <w:p/>
     <w:p>
+      <w:pPr>
+        <w:rPr>
+          <w:b/>
+          <w:bCs/>
+          <w:color w:val="0000FF"/>
+        </w:rPr>
+      </w:pPr>
       <w:r>
         <w:rPr>
           <w:b/>
@@ -403,7 +410,60 @@
         <w:t xml:space="preserve">핵심 청구항 후보: </w:t>
       </w:r>
       <w:r>
-        <w:t>복수의 가족 구성원 음성 데이터를 장기 누적 학습하여 해당 가족에 특화된 캐릭터 페르소나 응답을 생성하는 AI 인형 시스템 및 그 방법</w:t>
+        <w:rPr>
+          <w:lang w:eastAsia="ko-KR"/>
+          <w:b/>
+          <w:bCs/>
+          <w:color w:val="0000FF"/>
+          <w:rtl w:val="off"/>
+        </w:rPr>
+        <w:t>1)</w:t>
+      </w:r>
+      <w:r>
+        <w:rPr>
+          <w:b/>
+          <w:bCs/>
+          <w:color w:val="0000FF"/>
+        </w:rPr>
+        <w:t>복수의 가족 구성원 음성 데이터를 장기 누적 학습</w:t>
+      </w:r>
+      <w:r>
+        <w:t xml:space="preserve">하여 해당 가족에 </w:t>
+      </w:r>
+      <w:r>
+        <w:rPr>
+          <w:lang w:eastAsia="ko-KR"/>
+          <w:rtl w:val="off"/>
+        </w:rPr>
+        <w:t>2)</w:t>
+      </w:r>
+      <w:r>
+        <w:rPr>
+          <w:b/>
+          <w:bCs/>
+          <w:color w:val="0000FF"/>
+        </w:rPr>
+        <w:t>특화된 캐릭터 페르소나 응답을 생성하는 AI 인형</w:t>
+      </w:r>
+      <w:r>
+        <w:t xml:space="preserve"> 시스템 및 그 방법</w:t>
+      </w:r>
+      <w:r>
+        <w:rPr>
+          <w:lang w:eastAsia="ko-KR"/>
+          <w:rtl w:val="off"/>
+        </w:rPr>
+        <w:t xml:space="preserve"> , </w:t>
+      </w:r>
+      <w:r>
+        <w:rPr>
+          <w:lang w:eastAsia="ko-KR"/>
+          <w:b/>
+          <w:bCs/>
+          <w:color w:val="0000FF"/>
+          <w:rtl w:val="off"/>
+        </w:rPr>
+        <w:t>3) 장기 관계 발전의 표현 수단으로 대화가 쌓일수록 친해지는 표현의 발전 ( 무뚝뚝한 표현 --&gt; 친분 강화에 따른 친말도 향상 )</w:t>
       </w:r>
     </w:p>
     <w:p>

</xml_diff>